<commit_message>
feat(sorular): 2021–2025 konu sıklığına göre 3 × 50 soruluk karma test (KT1–KT3)
Her test: çok çıkan konulardan 32, orta çıkanlardan 12, az çıkanlardan 5,
hiç çıkmayan bir konudan 1 soru. 150 sorunun 84'ü çıkmış soruların bilgi
alanını yeni kurguyla, 66'sı sorulmamış hükümleri ölçer. Bütün kanıtlar
kaynakta doğrulandı; bağımsız doğrulamada 15 soru düzeltildi, 4 doğru şık
uzunluk dengesi için kısaltıldı. Her testte her harf 10 kez, art arda aynı
harf yok. Üretim hafızasına KT1–KT3 satırları (150) eklendi.

Co-Authored-By: Claude Opus 5.5 <noreply@anthropic.com>
Claude-Session: https://claude.ai/code/session_01JZw2RTXMFBeTrtL5daemH9
</commit_message>
<xml_diff>
--- a/sorular/GK_Karma_Test_1_50soru.docx
+++ b/sorular/GK_Karma_Test_1_50soru.docx
@@ -2229,7 +2229,7 @@
         <w:t xml:space="preserve">C) </w:t>
       </w:r>
       <w:r>
-        <w:t xml:space="preserve">VII sayılı listede yer alan eşyanın, listede karşısında gösterilen nihai ürünlerin imalinde kullanılmak kaydıyla ithal edilmesi halinde bu eşyaya ek mali yükümlülük uygulanmaz.</w:t>
+        <w:t xml:space="preserve">VII sayılı listedeki eşya, listede karşısında gösterilen nihai ürünlerin imalinde kullanılmak kaydıyla ithal edilirse bu eşyaya ek mali yükümlülük uygulanmaz.</w:t>
       </w:r>
     </w:p>
     <w:p>
@@ -2728,7 +2728,7 @@
         <w:t xml:space="preserve">D) </w:t>
       </w:r>
       <w:r>
-        <w:t xml:space="preserve">Ekonomik etkili bir gümrük rejimi hak sahibinin hak ve yükümlülükleri, söz konusu rejimden yararlanma koşullarını taşıyan kişilere devredilebilir.</w:t>
+        <w:t xml:space="preserve">Hariçte işleme rejimi, ekonomik etkili gümrük rejimleri arasında yer almakla birlikte şartlı muafiyet düzenlemesi sayılmaz.</w:t>
       </w:r>
     </w:p>
     <w:p>
@@ -3120,7 +3120,7 @@
         <w:t xml:space="preserve">C) </w:t>
       </w:r>
       <w:r>
-        <w:t xml:space="preserve">Gümrük idareleri tarafından işletilmeyen antrepolardaki tüm eşyanın antrepo kayıtları işletici tarafından tutulur.</w:t>
+        <w:t xml:space="preserve">Antrepolarda yapılan sayım sonucunda noksan çıkan eşyanın gümrük vergileri, duruma göre işletici veya kullanıcıdan tahsil edilir.</w:t>
       </w:r>
     </w:p>
     <w:p>
@@ -10465,7 +10465,7 @@
         <w:t xml:space="preserve">C) </w:t>
       </w:r>
       <w:r>
-        <w:t xml:space="preserve">VII sayılı listede yer alan eşyanın, listede karşısında gösterilen nihai ürünlerin imalinde kullanılmak kaydıyla ithal edilmesi halinde bu eşyaya ek mali yükümlülük uygulanmaz.</w:t>
+        <w:t xml:space="preserve">VII sayılı listedeki eşya, listede karşısında gösterilen nihai ürünlerin imalinde kullanılmak kaydıyla ithal edilirse bu eşyaya ek mali yükümlülük uygulanmaz.</w:t>
       </w:r>
     </w:p>
     <w:p>
@@ -11286,7 +11286,7 @@
           <w:sz w:val="20"/>
           <w:szCs w:val="20"/>
         </w:rPr>
-        <w:t xml:space="preserve">GK 79/3, 80/1, 81/2, 82, 83</w:t>
+        <w:t xml:space="preserve">GK 79/1, 79/3, 80/1, 81/2, 82</w:t>
       </w:r>
     </w:p>
     <w:p>
@@ -11354,7 +11354,7 @@
         <w:t xml:space="preserve">D) </w:t>
       </w:r>
       <w:r>
-        <w:t xml:space="preserve">Ekonomik etkili bir gümrük rejimi hak sahibinin hak ve yükümlülükleri, söz konusu rejimden yararlanma koşullarını taşıyan kişilere devredilebilir.</w:t>
+        <w:t xml:space="preserve">Hariçte işleme rejimi, ekonomik etkili gümrük rejimleri arasında yer almakla birlikte şartlı muafiyet düzenlemesi sayılmaz.</w:t>
       </w:r>
     </w:p>
     <w:p>
@@ -11403,7 +11403,7 @@
         <w:t xml:space="preserve">Gerekçe: </w:t>
       </w:r>
       <w:r>
-        <w:t xml:space="preserve">Gümrük Kanununa göre “değişmemiş eşya” deyimi, dahilde işleme veya gümrük kontrolü altında işleme rejimleri çerçevesinde hiçbir şekilde işçilik görmemiş ithal eşyası anlamına gelir; tanım yalnızca dahilde işleme rejimiyle sınırlı değildir, gümrük kontrolü altında işleme rejimini de kapsar. Diğer ifadeler doğrudur: şartlı muafiyet düzenlemesine tabi tutulma her türlü gümrük vergisine karşılık teminat verilmesi şartına bağlıdır; dahilde ve hariçte işleme rejimlerinin usul ve esaslarını Cumhurbaşkanı belirler; ekonomik etkili şartlı muafiyet düzenlemesi gümrükçe onaylanmış yeni bir işlem veya kullanım tayiniyle sona erer; hak ve yükümlülükler rejim koşullarını taşıyan kişilere devredilebilir. Bu nedenle doğru cevap E seçeneğidir. (MD GK 79/3, 80/1, 81/2, 82, 83)</w:t>
+        <w:t xml:space="preserve">Gümrük Kanununa göre “değişmemiş eşya” deyimi, dahilde işleme veya gümrük kontrolü altında işleme rejimleri çerçevesinde hiçbir şekilde işçilik görmemiş ithal eşyası anlamına gelir; tanım yalnızca dahilde işleme rejimiyle sınırlı değildir, gümrük kontrolü altında işleme rejimini de kapsar. Diğer ifadeler doğrudur: şartlı muafiyet düzenlemesine tabi tutulma her türlü gümrük vergisine karşılık teminat verilmesi şartına bağlıdır; dahilde ve hariçte işleme rejimlerinin usul ve esaslarını Cumhurbaşkanı belirler; ekonomik etkili şartlı muafiyet düzenlemesi gümrükçe onaylanmış yeni bir işlem veya kullanım tayiniyle sona erer; hariçte işleme rejimi ekonomik etkili gümrük rejimleri (antrepo, dahilde işleme, gümrük kontrolü altında işleme, geçici ithalat, hariçte işleme) arasında yer alır, ancak şartlı muafiyet düzenlemeleri (transit, antrepo, şartlı muafiyet sistemi kapsamında dahilde işleme, gümrük kontrolü altında işleme, geçici ithalat) arasında sayılmamıştır. Bu nedenle doğru cevap E seçeneğidir. (MD GK 79/1, 79/3, 80/1, 81/2, 82)</w:t>
       </w:r>
     </w:p>
     <w:p>
@@ -12016,7 +12016,7 @@
           <w:sz w:val="20"/>
           <w:szCs w:val="20"/>
         </w:rPr>
-        <w:t xml:space="preserve">GK 96, 97/2, 99, 106/2</w:t>
+        <w:t xml:space="preserve">GK 96, 97/2, 105/2, 106/2</w:t>
       </w:r>
     </w:p>
     <w:p>
@@ -12071,7 +12071,7 @@
         <w:t xml:space="preserve">C) </w:t>
       </w:r>
       <w:r>
-        <w:t xml:space="preserve">Gümrük idareleri tarafından işletilmeyen antrepolardaki tüm eşyanın antrepo kayıtları işletici tarafından tutulur.</w:t>
+        <w:t xml:space="preserve">Antrepolarda yapılan sayım sonucunda noksan çıkan eşyanın gümrük vergileri, duruma göre işletici veya kullanıcıdan tahsil edilir.</w:t>
       </w:r>
     </w:p>
     <w:p>
@@ -12133,7 +12133,7 @@
         <w:t xml:space="preserve">Gerekçe: </w:t>
       </w:r>
       <w:r>
-        <w:t xml:space="preserve">Kanuna göre antrepodaki eşya gümrüklenmiş kıymeti üzerinden sigorta ettirilmişse noksan çıkan eşyanın vergileri sigorta ettirenden veya lehine sigorta ettirilenden alınır; vergilerin işleticiden alınacağı ifadesi yanlıştır. İşleticinin izinde belirtilen özel şartlara uyma sorumluluğu, kullanıcının rejime ilişkin yükümlülüklerden her halükarda sorumlu olması, gümrük idarelerince işletilmeyen antrepolarda kayıtların işletici tarafından tutulması ve eşyanın niteliğinden kaynaklanan kayıp ve firelerde vergi aranmaması Kanunda yer alan hükümlerdir. Bu nedenle doğru cevap D seçeneğidir. (MD GK 96, 97/2, 99, 106/2)</w:t>
+        <w:t xml:space="preserve">Kanuna göre antrepodaki eşya gümrüklenmiş kıymeti üzerinden sigorta ettirilmişse noksan çıkan eşyanın vergileri sigorta ettirenden veya lehine sigorta ettirilenden alınır; vergilerin işleticiden alınacağı ifadesi yanlıştır. İşleticinin izinde belirtilen özel şartlara uyma sorumluluğu, kullanıcının rejime ilişkin yükümlülüklerden her halükarda sorumlu olması, sayımda noksan çıkan eşyanın vergilerinin duruma göre işletici veya kullanıcıdan tahsil edilmesi ve eşyanın niteliğinden kaynaklanan kayıp ve firelerde vergi aranmaması Kanunda yer alan hükümlerdir. Bu nedenle doğru cevap D seçeneğidir. (MD GK 96, 97/2, 105/2, 106/2)</w:t>
       </w:r>
     </w:p>
     <w:p>

</xml_diff>